<commit_message>
feat: add SP 1 document template for violations in public templates
</commit_message>
<xml_diff>
--- a/public/templates/pelanggaran/SURAT_PERINGATAN_1.docx
+++ b/public/templates/pelanggaran/SURAT_PERINGATAN_1.docx
@@ -780,7 +780,7 @@
           <w:sz w:val="24"/>
           <w:szCs w:val="24"/>
         </w:rPr>
-        <w:t>Peraturan Menteri Agraria dan Tata Ruang/Kepala Badan Pertanahan Nasional Nomor 21 Tahun 2021 tentang Pelaksanaan Pengendalian Pemanfaatan Ruang dan Pengawasan Penataan Ruang;</w:t>
+        <w:t>Peraturan Menteri Agraria dan Tata Ruang/Kepala Badan Pertanahan Nasional Nomor 21 Tahun 2021 tentang Pelaksanaan Pengendalian Pemanfaatan Ruang dan Pengawasan Penataan Ruang (Berita Negara Republik Indonesia Tahun 2021 Nomor 1484);</w:t>
       </w:r>
     </w:p>
     <w:p>
@@ -804,7 +804,7 @@
           <w:sz w:val="24"/>
           <w:szCs w:val="24"/>
         </w:rPr>
-        <w:t>Peraturan Menteri Agraria dan Tata Ruang/Kepala Badan Pertanahan Nasional Nomor 21 Tahun 2021 tentang Pelaksanaan Pengendalian Pemanfaatan Ruang dan Pengawasan Penataan Ruang (Berita Negara Republik Indonesia Tahun 2021 Nomor 1484);</w:t>
+        <w:t>Petunjuk Teknis tentang Pengenaan Sanksi Administratif Nomor: 5/JUKNIS-700 HK.02.02/XII/2023;</w:t>
       </w:r>
     </w:p>
     <w:p>
@@ -818,30 +818,6 @@
         <w:jc w:val="both"/>
         <w:rPr>
           <w:rFonts w:ascii="Times New Roman" w:eastAsia="Times New Roman" w:hAnsi="Times New Roman" w:cs="Times New Roman"/>
-          <w:sz w:val="24"/>
-          <w:szCs w:val="24"/>
-        </w:rPr>
-      </w:pPr>
-      <w:r>
-        <w:rPr>
-          <w:rFonts w:ascii="Times New Roman" w:eastAsia="Times New Roman" w:hAnsi="Times New Roman" w:cs="Times New Roman"/>
-          <w:sz w:val="24"/>
-          <w:szCs w:val="24"/>
-        </w:rPr>
-        <w:t>Petunjuk Teknis tentang Pengenaan Sanksi Administratif Nomor: 5/JUKNIS-700 HK.02.02/XII/2023;</w:t>
-      </w:r>
-    </w:p>
-    <w:p>
-      <w:pPr>
-        <w:numPr>
-          <w:ilvl w:val="0"/>
-          <w:numId w:val="1"/>
-        </w:numPr>
-        <w:spacing w:after="0" w:line="276" w:lineRule="auto"/>
-        <w:ind w:left="426"/>
-        <w:jc w:val="both"/>
-        <w:rPr>
-          <w:rFonts w:ascii="Times New Roman" w:eastAsia="Times New Roman" w:hAnsi="Times New Roman" w:cs="Times New Roman"/>
           <w:color w:val="FF0000"/>
           <w:sz w:val="24"/>
           <w:szCs w:val="24"/>
@@ -913,14 +889,14 @@
           <w:sz w:val="24"/>
           <w:szCs w:val="24"/>
         </w:rPr>
-        <w:t>Pasal 45, Pasal 46 dan Pasal 47. Pasal 47 (GSB);  24 Ayat 2. (Kawasan RTH), Pasal 28 tentang zona pertanian.</w:t>
+        <w:t>Pasal 45, Pasal 46 dan Pasal 47.</w:t>
       </w:r>
       <w:r>
         <w:rPr>
           <w:rFonts w:ascii="Bookman Old Style" w:eastAsia="Bookman Old Style" w:hAnsi="Bookman Old Style" w:cs="Bookman Old Style"/>
-          <w:color w:val="FF0000"/>
-        </w:rPr>
-        <w:t xml:space="preserve">    </w:t>
+          <w:color w:val="00B0F0"/>
+        </w:rPr>
+        <w:t xml:space="preserve"> </w:t>
       </w:r>
     </w:p>
     <w:p>
@@ -969,7 +945,23 @@
           <w:sz w:val="24"/>
           <w:szCs w:val="24"/>
         </w:rPr>
-        <w:t xml:space="preserve">Berdasarkan hasil kajian teknis, kajian hukum dan berdasarkan analisa serta kunjungan lapangan bahwa bangunan </w:t>
+        <w:t>Berdasarkan hasil kajian teknis, kajian hukum dan berdasarkan analisa serta kunjungan lapangan bahwa bangunan</w:t>
+      </w:r>
+      <w:r>
+        <w:rPr>
+          <w:rFonts w:ascii="Times New Roman" w:eastAsia="Times New Roman" w:hAnsi="Times New Roman" w:cs="Times New Roman"/>
+          <w:sz w:val="24"/>
+          <w:szCs w:val="24"/>
+        </w:rPr>
+        <w:t xml:space="preserve"> peruntukkan pada</w:t>
+      </w:r>
+      <w:r>
+        <w:rPr>
+          <w:rFonts w:ascii="Times New Roman" w:eastAsia="Times New Roman" w:hAnsi="Times New Roman" w:cs="Times New Roman"/>
+          <w:sz w:val="24"/>
+          <w:szCs w:val="24"/>
+        </w:rPr>
+        <w:t xml:space="preserve"> </w:t>
       </w:r>
       <w:r>
         <w:rPr>
@@ -1362,34 +1354,7 @@
           <w:sz w:val="24"/>
           <w:szCs w:val="24"/>
         </w:rPr>
-        <w:lastRenderedPageBreak/>
         <w:t>Berkewajiban mengurangi dampak akibat kegiatan konstruksi yang ditimbulkan apabila saat ini sedang dalam pelaksanaan kegiatan pembangunan;</w:t>
-      </w:r>
-    </w:p>
-    <w:p>
-      <w:pPr>
-        <w:numPr>
-          <w:ilvl w:val="1"/>
-          <w:numId w:val="3"/>
-        </w:numPr>
-        <w:spacing w:after="0" w:line="276" w:lineRule="auto"/>
-        <w:ind w:left="709" w:hanging="283"/>
-        <w:jc w:val="both"/>
-        <w:rPr>
-          <w:rFonts w:ascii="Times New Roman" w:eastAsia="Times New Roman" w:hAnsi="Times New Roman" w:cs="Times New Roman"/>
-          <w:color w:val="FF0000"/>
-          <w:sz w:val="24"/>
-          <w:szCs w:val="24"/>
-        </w:rPr>
-      </w:pPr>
-      <w:r>
-        <w:rPr>
-          <w:rFonts w:ascii="Times New Roman" w:eastAsia="Times New Roman" w:hAnsi="Times New Roman" w:cs="Times New Roman"/>
-          <w:color w:val="FF0000"/>
-          <w:sz w:val="24"/>
-          <w:szCs w:val="24"/>
-        </w:rPr>
-        <w:t>Pilih dan tambahkan atau hapus sesuai kebutuhan</w:t>
       </w:r>
     </w:p>
     <w:p>
@@ -1474,7 +1439,16 @@
           <w:sz w:val="24"/>
           <w:szCs w:val="24"/>
         </w:rPr>
-        <w:t xml:space="preserve"> diminta untuk melakukan klarifikasi dengan membawa dokumen perizinan yang terkait (bila ada) ke Dinas Pekerjaan Umum dan Penataan Ruang Kota Mataram bidang tata ruang seksi pengawasan dan pengendalian di hari kerja Senin s/d Kamis pukul 08.00 – 16.00 Wita dan Jumat pukul 08.00 - 11.00 Wita dengan melakukan janji temu terlebih dahulu melalui Nomor WhatsApp (WA) </w:t>
+        <w:t xml:space="preserve"> diminta untuk melakukan klarifikasi dengan membawa dokumen perizinan yang terkait (bila ada) ke Dinas Pekerjaan Umum dan Penataan Ruang </w:t>
+      </w:r>
+      <w:r>
+        <w:rPr>
+          <w:rFonts w:ascii="Times New Roman" w:eastAsia="Times New Roman" w:hAnsi="Times New Roman" w:cs="Times New Roman"/>
+          <w:sz w:val="24"/>
+          <w:szCs w:val="24"/>
+        </w:rPr>
+        <w:lastRenderedPageBreak/>
+        <w:t xml:space="preserve">Kota Mataram bidang tata ruang seksi pengawasan dan pengendalian di hari kerja Senin s/d Kamis pukul 08.00 – 16.00 Wita dan Jumat pukul 08.00 - 11.00 Wita dengan melakukan janji temu terlebih dahulu melalui Nomor WhatsApp (WA) </w:t>
       </w:r>
       <w:r>
         <w:rPr>
@@ -2090,6 +2064,78 @@
         </w:rPr>
         <w:t>Lurah ..............</w:t>
       </w:r>
+    </w:p>
+    <w:p>
+      <w:pPr>
+        <w:spacing w:after="0" w:line="276" w:lineRule="auto"/>
+        <w:rPr>
+          <w:rFonts w:ascii="Times New Roman" w:eastAsia="Times New Roman" w:hAnsi="Times New Roman" w:cs="Times New Roman"/>
+          <w:b/>
+          <w:bCs/>
+          <w:sz w:val="24"/>
+          <w:szCs w:val="24"/>
+        </w:rPr>
+      </w:pPr>
+    </w:p>
+    <w:p>
+      <w:pPr>
+        <w:spacing w:after="0" w:line="276" w:lineRule="auto"/>
+        <w:rPr>
+          <w:rFonts w:ascii="Times New Roman" w:eastAsia="Times New Roman" w:hAnsi="Times New Roman" w:cs="Times New Roman"/>
+          <w:b/>
+          <w:bCs/>
+          <w:sz w:val="24"/>
+          <w:szCs w:val="24"/>
+        </w:rPr>
+      </w:pPr>
+    </w:p>
+    <w:p>
+      <w:pPr>
+        <w:spacing w:after="0" w:line="276" w:lineRule="auto"/>
+        <w:rPr>
+          <w:rFonts w:ascii="Times New Roman" w:eastAsia="Times New Roman" w:hAnsi="Times New Roman" w:cs="Times New Roman"/>
+          <w:b/>
+          <w:bCs/>
+          <w:sz w:val="24"/>
+          <w:szCs w:val="24"/>
+        </w:rPr>
+      </w:pPr>
+    </w:p>
+    <w:p>
+      <w:pPr>
+        <w:spacing w:after="0" w:line="276" w:lineRule="auto"/>
+        <w:rPr>
+          <w:rFonts w:ascii="Times New Roman" w:eastAsia="Times New Roman" w:hAnsi="Times New Roman" w:cs="Times New Roman"/>
+          <w:b/>
+          <w:bCs/>
+          <w:sz w:val="24"/>
+          <w:szCs w:val="24"/>
+        </w:rPr>
+      </w:pPr>
+    </w:p>
+    <w:p>
+      <w:pPr>
+        <w:spacing w:after="0" w:line="276" w:lineRule="auto"/>
+        <w:rPr>
+          <w:rFonts w:ascii="Times New Roman" w:eastAsia="Times New Roman" w:hAnsi="Times New Roman" w:cs="Times New Roman"/>
+          <w:b/>
+          <w:bCs/>
+          <w:sz w:val="24"/>
+          <w:szCs w:val="24"/>
+        </w:rPr>
+      </w:pPr>
+    </w:p>
+    <w:p>
+      <w:pPr>
+        <w:spacing w:after="0" w:line="276" w:lineRule="auto"/>
+        <w:rPr>
+          <w:rFonts w:ascii="Times New Roman" w:eastAsia="Times New Roman" w:hAnsi="Times New Roman" w:cs="Times New Roman"/>
+          <w:b/>
+          <w:bCs/>
+          <w:sz w:val="24"/>
+          <w:szCs w:val="24"/>
+        </w:rPr>
+      </w:pPr>
     </w:p>
     <w:p>
       <w:pPr>
@@ -5718,7 +5764,7 @@
   <w:abstractNum w:abstractNumId="0" w15:restartNumberingAfterBreak="0">
     <w:nsid w:val="369A7CAA"/>
     <w:multiLevelType w:val="multilevel"/>
-    <w:tmpl w:val="BB5C5C18"/>
+    <w:tmpl w:val="03CAAF92"/>
     <w:lvl w:ilvl="0">
       <w:start w:val="1"/>
       <w:numFmt w:val="decimal"/>
@@ -5727,6 +5773,11 @@
       <w:pPr>
         <w:ind w:left="720" w:hanging="360"/>
       </w:pPr>
+      <w:rPr>
+        <w:b w:val="0"/>
+        <w:bCs w:val="0"/>
+        <w:color w:val="auto"/>
+      </w:rPr>
     </w:lvl>
     <w:lvl w:ilvl="1">
       <w:start w:val="1"/>
@@ -6600,6 +6651,7 @@
   <w:style w:type="character" w:default="1" w:styleId="DefaultParagraphFont">
     <w:name w:val="Default Paragraph Font"/>
     <w:uiPriority w:val="1"/>
+    <w:semiHidden/>
     <w:unhideWhenUsed/>
   </w:style>
   <w:style w:type="table" w:default="1" w:styleId="TableNormal">

</xml_diff>